<commit_message>
Updated the reference list
</commit_message>
<xml_diff>
--- a/References.docx
+++ b/References.docx
@@ -29,28 +29,12 @@
     </w:p>
     <w:p>
       <w:r>
-        <w:t xml:space="preserve">https://www.energysage.com/electricity/house-watts/how-many-watts-does-a-computer-use/ </w:t>
-      </w:r>
-      <w:proofErr w:type="gramStart"/>
-      <w:r>
-        <w:t>( computer</w:t>
-      </w:r>
-      <w:proofErr w:type="gramEnd"/>
-      <w:r>
-        <w:t xml:space="preserve"> watt usage)</w:t>
-      </w:r>
-    </w:p>
-    <w:p>
-      <w:r>
-        <w:t xml:space="preserve">https://www.eesi.org/articles/view/data-centers-and-water-consumption </w:t>
-      </w:r>
-      <w:proofErr w:type="gramStart"/>
-      <w:r>
-        <w:t>( data</w:t>
-      </w:r>
-      <w:proofErr w:type="gramEnd"/>
-      <w:r>
-        <w:t xml:space="preserve"> </w:t>
+        <w:t>https://www.energysage.com/electricity/house-watts/how-many-watts-does-a-computer-use/ ( computer watt usage)</w:t>
+      </w:r>
+    </w:p>
+    <w:p>
+      <w:r>
+        <w:t xml:space="preserve">https://www.eesi.org/articles/view/data-centers-and-water-consumption ( data </w:t>
       </w:r>
       <w:proofErr w:type="spellStart"/>
       <w:r>
@@ -58,13 +42,8 @@
       </w:r>
       <w:proofErr w:type="spellEnd"/>
       <w:r>
-        <w:t xml:space="preserve"> water </w:t>
-      </w:r>
-      <w:proofErr w:type="gramStart"/>
-      <w:r>
-        <w:t>consumption )</w:t>
-      </w:r>
-      <w:proofErr w:type="gramEnd"/>
+        <w:t xml:space="preserve"> water consumption )</w:t>
+      </w:r>
     </w:p>
     <w:p>
       <w:pPr>
@@ -255,6 +234,48 @@
       </w:pPr>
       <w:r>
         <w:t>Conclusion references:</w:t>
+      </w:r>
+    </w:p>
+    <w:p/>
+    <w:p>
+      <w:hyperlink r:id="rId4" w:history="1">
+        <w:r>
+          <w:rPr>
+            <w:rStyle w:val="Hyperlink"/>
+          </w:rPr>
+          <w:t>https://wp.towson.edu/iajournal/2021/12/13/video-gaming-addiction-a-case-study-of-china-and-south-korea/</w:t>
+        </w:r>
+      </w:hyperlink>
+      <w:r>
+        <w:t xml:space="preserve"> ( Video gaming addiction case study)</w:t>
+      </w:r>
+    </w:p>
+    <w:p/>
+    <w:p>
+      <w:hyperlink r:id="rId5" w:history="1">
+        <w:r>
+          <w:rPr>
+            <w:rStyle w:val="Hyperlink"/>
+          </w:rPr>
+          <w:t>https://www.gamedeveloper.com/game-platforms/uk-study-discusses-motives-for-game-piracy</w:t>
+        </w:r>
+      </w:hyperlink>
+      <w:r>
+        <w:t xml:space="preserve"> ( Piracy case study)</w:t>
+      </w:r>
+    </w:p>
+    <w:p/>
+    <w:p>
+      <w:hyperlink r:id="rId6" w:history="1">
+        <w:r>
+          <w:rPr>
+            <w:rStyle w:val="Hyperlink"/>
+          </w:rPr>
+          <w:t>https://www.computer.org/csdl/journal/oj/2024/01/10430375/1UoCfv1yEmI</w:t>
+        </w:r>
+      </w:hyperlink>
+      <w:r>
+        <w:t xml:space="preserve"> ( The connection between malware and piracy case ) </w:t>
       </w:r>
     </w:p>
     <w:sectPr>
@@ -869,6 +890,7 @@
   <w:style w:type="character" w:default="1" w:styleId="DefaultParagraphFont">
     <w:name w:val="Default Paragraph Font"/>
     <w:uiPriority w:val="1"/>
+    <w:semiHidden/>
     <w:unhideWhenUsed/>
   </w:style>
   <w:style w:type="table" w:default="1" w:styleId="TableNormal">
@@ -1179,6 +1201,29 @@
       <w:smallCaps/>
       <w:color w:val="0F4761" w:themeColor="accent1" w:themeShade="BF"/>
       <w:spacing w:val="5"/>
+    </w:rPr>
+  </w:style>
+  <w:style w:type="character" w:styleId="Hyperlink">
+    <w:name w:val="Hyperlink"/>
+    <w:basedOn w:val="DefaultParagraphFont"/>
+    <w:uiPriority w:val="99"/>
+    <w:unhideWhenUsed/>
+    <w:rsid w:val="007B736F"/>
+    <w:rPr>
+      <w:color w:val="467886" w:themeColor="hyperlink"/>
+      <w:u w:val="single"/>
+    </w:rPr>
+  </w:style>
+  <w:style w:type="character" w:styleId="UnresolvedMention">
+    <w:name w:val="Unresolved Mention"/>
+    <w:basedOn w:val="DefaultParagraphFont"/>
+    <w:uiPriority w:val="99"/>
+    <w:semiHidden/>
+    <w:unhideWhenUsed/>
+    <w:rsid w:val="007B736F"/>
+    <w:rPr>
+      <w:color w:val="605E5C"/>
+      <w:shd w:val="clear" w:color="auto" w:fill="E1DFDD"/>
     </w:rPr>
   </w:style>
 </w:styles>

</xml_diff>